<commit_message>
ASE: remove Hung-Son Nguyen from authors; AI disclosure in Acknowledgements per Sage policy; Word layout per writing rules (figures after first citation, centred title block, justified text, centred tables with numeric columns right-aligned, 3-column equation layout, hanging-indent references)
Co-Authored-By: Claude Opus 5.5 <noreply@anthropic.com>
Claude-Session: https://claude.ai/code/session_01LGLpDzAMfdMgWcXQjLxauw
</commit_message>
<xml_diff>
--- a/manuscript/ase/word/Cover_Letter_ASE.docx
+++ b/manuscript/ase/word/Cover_Letter_ASE.docx
@@ -241,7 +241,7 @@
         <w:pStyle w:val="BodyText"/>
       </w:pPr>
       <w:r>
-        <w:t xml:space="preserve">on behalf of Quoc-Bao Nguyen and Hung-Son Nguyen</w:t>
+        <w:t xml:space="preserve">on behalf of Quoc-Bao Nguyen</w:t>
       </w:r>
     </w:p>
     <w:sectPr>
@@ -526,7 +526,9 @@
     <w:basedOn w:val="Normal"/>
     <w:link w:val="BodyTextChar"/>
     <w:pPr>
+      <w:widowControl/>
       <w:spacing w:after="120" w:before="180" w:line="360" w:lineRule="auto"/>
+      <w:jc w:val="both"/>
     </w:pPr>
     <w:qFormat/>
     <w:rPr>
@@ -540,7 +542,9 @@
     <w:next w:val="BodyText"/>
     <w:qFormat/>
     <w:pPr>
+      <w:widowControl/>
       <w:spacing w:after="120" w:line="360" w:lineRule="auto"/>
+      <w:jc w:val="both"/>
     </w:pPr>
     <w:rPr>
       <w:rFonts w:ascii="Times New Roman" w:cs="Times New Roman" w:eastAsia="Times New Roman" w:hAnsi="Times New Roman"/>
@@ -655,7 +659,9 @@
     <w:pPr>
       <w:keepNext/>
       <w:keepLines/>
+      <w:widowControl/>
       <w:spacing w:after="300" w:before="100" w:line="360" w:lineRule="auto"/>
+      <w:jc w:val="both"/>
     </w:pPr>
     <w:rPr>
       <w:rFonts w:ascii="Times New Roman" w:cs="Times New Roman" w:eastAsia="Times New Roman" w:hAnsi="Times New Roman"/>
@@ -669,7 +675,9 @@
     <w:next w:val="Bibliography"/>
     <w:qFormat/>
     <w:pPr>
+      <w:widowControl/>
       <w:spacing w:line="360" w:lineRule="auto"/>
+      <w:jc w:val="both"/>
     </w:pPr>
     <w:rPr>
       <w:rFonts w:ascii="Times New Roman" w:cs="Times New Roman" w:eastAsia="Times New Roman" w:hAnsi="Times New Roman"/>
@@ -686,6 +694,7 @@
       <w:keepNext/>
       <w:keepLines/>
       <w:spacing w:after="0" w:before="480" w:line="360" w:lineRule="auto"/>
+      <w:jc w:val="left"/>
       <w:outlineLvl w:val="0"/>
     </w:pPr>
     <w:rPr>
@@ -709,6 +718,7 @@
       <w:keepNext/>
       <w:keepLines/>
       <w:spacing w:after="0" w:before="200" w:line="360" w:lineRule="auto"/>
+      <w:jc w:val="left"/>
       <w:outlineLvl w:val="1"/>
     </w:pPr>
     <w:rPr>
@@ -732,6 +742,7 @@
       <w:keepNext/>
       <w:keepLines/>
       <w:spacing w:after="0" w:before="200" w:line="360" w:lineRule="auto"/>
+      <w:jc w:val="left"/>
       <w:outlineLvl w:val="2"/>
     </w:pPr>
     <w:rPr>
@@ -982,8 +993,16 @@
   <w:style w:customStyle="1" w:styleId="Figure" w:type="paragraph">
     <w:name w:val="Figure"/>
     <w:basedOn w:val="Normal"/>
-    <w:rPr>
-      <w:rFonts w:ascii="Times New Roman" w:cs="Times New Roman" w:eastAsia="Times New Roman" w:hAnsi="Times New Roman"/>
+    <w:pPr>
+      <w:keepNext/>
+      <w:widowControl/>
+      <w:spacing w:after="0" w:before="120" w:line="240" w:lineRule="auto"/>
+      <w:jc w:val="center"/>
+    </w:pPr>
+    <w:rPr>
+      <w:rFonts w:ascii="Times New Roman" w:cs="Times New Roman" w:eastAsia="Times New Roman" w:hAnsi="Times New Roman"/>
+      <w:i w:val="0"/>
+      <w:sz w:val="24"/>
     </w:rPr>
   </w:style>
   <w:style w:customStyle="1" w:styleId="CaptionedFigure" w:type="paragraph">
@@ -1043,6 +1062,51 @@
       <w:b w:val="0"/>
       <w:bCs w:val="0"/>
       <w:color w:themeColor="accent1" w:themeShade="BF" w:val="365F91"/>
+    </w:rPr>
+  </w:style>
+  <w:style w:customStyle="1" w:styleId="Titleblock" w:type="paragraph">
+    <w:name w:val="Title block"/>
+    <w:basedOn w:val="Normal"/>
+    <w:pPr>
+      <w:keepNext w:val="0"/>
+      <w:widowControl/>
+      <w:spacing w:after="120" w:before="0" w:line="360" w:lineRule="auto"/>
+      <w:jc w:val="center"/>
+    </w:pPr>
+    <w:rPr>
+      <w:rFonts w:ascii="Times New Roman" w:hAnsi="Times New Roman"/>
+      <w:i w:val="0"/>
+      <w:sz w:val="24"/>
+    </w:rPr>
+  </w:style>
+  <w:style w:customStyle="1" w:styleId="Captioncentred" w:type="paragraph">
+    <w:name w:val="Caption centred"/>
+    <w:basedOn w:val="Normal"/>
+    <w:pPr>
+      <w:keepNext w:val="0"/>
+      <w:widowControl/>
+      <w:spacing w:after="240" w:before="0" w:line="276" w:lineRule="auto"/>
+      <w:jc w:val="center"/>
+    </w:pPr>
+    <w:rPr>
+      <w:rFonts w:ascii="Times New Roman" w:hAnsi="Times New Roman"/>
+      <w:i w:val="0"/>
+      <w:sz w:val="22"/>
+    </w:rPr>
+  </w:style>
+  <w:style w:customStyle="1" w:styleId="Captionjustified" w:type="paragraph">
+    <w:name w:val="Caption justified"/>
+    <w:basedOn w:val="Normal"/>
+    <w:pPr>
+      <w:keepNext w:val="0"/>
+      <w:widowControl/>
+      <w:spacing w:after="240" w:before="0" w:line="276" w:lineRule="auto"/>
+      <w:jc w:val="both"/>
+    </w:pPr>
+    <w:rPr>
+      <w:rFonts w:ascii="Times New Roman" w:hAnsi="Times New Roman"/>
+      <w:i w:val="0"/>
+      <w:sz w:val="22"/>
     </w:rPr>
   </w:style>
   <w:style w:customStyle="1" w:styleId="Figureplaceholder" w:type="paragraph">

</xml_diff>

<commit_message>
ASE: American spelling (rule V.1), relabel Figs 3 and 7 (normalized, misfit ratio, gray; 300 dpi), graphical abstract, rebuild package
Co-Authored-By: Claude Opus 5.5 <noreply@anthropic.com>
Claude-Session: https://claude.ai/code/session_01LGLpDzAMfdMgWcXQjLxauw
</commit_message>
<xml_diff>
--- a/manuscript/ase/word/Cover_Letter_ASE.docx
+++ b/manuscript/ase/word/Cover_Letter_ASE.docx
@@ -108,7 +108,7 @@
         <w:pStyle w:val="BodyText"/>
       </w:pPr>
       <w:r>
-        <w:t xml:space="preserve">Monitoring the loads that a bridge actually carries is often done with few channels, by integrating one response record and dividing by a calibration constant. On continuous girders this constant can vanish, because influence lines change sign over the piers. The manuscript gives structural engineers criteria for choosing, before installation, channels and positions that observe the load, and for judging whether their constant can be trusted when the pier stiffness is uncertain. The underlying identity and the generalised least-squares estimator are classical, and the manuscript says so; the contributions are the criteria built on them:</w:t>
+        <w:t xml:space="preserve">Monitoring the loads that a bridge actually carries is often done with few channels, by integrating one response record and dividing by a calibration constant. On continuous girders this constant can vanish, because influence lines change sign over the piers. The manuscript gives structural engineers criteria for choosing, before installation, channels and positions that observe the load, and for judging whether their constant can be trusted when the pier stiffness is uncertain. The underlying identity and the generalized least-squares estimator are classical, and the manuscript says so; the contributions are the criteria built on them:</w:t>
       </w:r>
     </w:p>
     <w:p>
@@ -120,7 +120,7 @@
         <w:pStyle w:val="BodyText"/>
       </w:pPr>
       <w:r>
-        <w:t xml:space="preserve">a closed-form catalogue of blind loci for five channel types on two- and three-span and haunched girders, with indicators that need no reference rigidity, showing that strain gauges are blind at every zero of the uniform-load moment and nearly blind in a band that can contain gauges set back from the piers;</w:t>
+        <w:t xml:space="preserve">a closed-form catalog of blind loci for five channel types on two- and three-span and haunched girders, with indicators that need no reference rigidity, showing that strain gauges are blind at every zero of the uniform-load moment and nearly blind in a band that can contain gauges set back from the piers;</w:t>
       </w:r>
     </w:p>
     <w:p>
@@ -178,7 +178,7 @@
         <w:t xml:space="preserve"> </w:t>
       </w:r>
       <w:r>
-        <w:t xml:space="preserve">The field strain records are from the public NOR-BWIM dataset (figshare, https://doi.org/10.7294/26880898.v1, CC0 licence). The laboratory data, the processed data of the in-service bridge, the derived data behind every figure and table, and all analysis scripts with their console output are provided as Supplementary Material.</w:t>
+        <w:t xml:space="preserve">The field strain records are from the public NOR-BWIM dataset (figshare, https://doi.org/10.7294/26880898.v1, CC0 license). The laboratory data, the processed data of the in-service bridge, the derived data behind every figure and table, and all analysis scripts with their console output are provided as Supplementary Material.</w:t>
       </w:r>
     </w:p>
     <w:p>

</xml_diff>

<commit_message>
ASE: abstract shortened (184 to ~165 words), four ASE papers cited after three-source check, submission date in cover letter, XII.13 round-5 fixes, merged upright math subscripts and capped tall figures in Word build
Co-Authored-By: Claude Opus 5.5 <noreply@anthropic.com>
Claude-Session: https://claude.ai/code/session_01B18ehnY6ZEjmwZNzrTta57
</commit_message>
<xml_diff>
--- a/manuscript/ase/word/Cover_Letter_ASE.docx
+++ b/manuscript/ase/word/Cover_Letter_ASE.docx
@@ -7,7 +7,7 @@
         <w:pStyle w:val="FirstParagraph"/>
       </w:pPr>
       <w:r>
-        <w:t xml:space="preserve">[date of submission]</w:t>
+        <w:t xml:space="preserve">20 October 2026</w:t>
       </w:r>
     </w:p>
     <w:p>
@@ -160,7 +160,7 @@
         <w:pStyle w:val="BodyText"/>
       </w:pPr>
       <w:r>
-        <w:t xml:space="preserve">The manuscript builds on bridge weigh-in-motion work published in this journal, including the review by Yu, Cai and Deng (2016). It is about 11,000 word-equivalents with 7 figures and 4 tables; derivations, full field tables and the error budget are in the Supplementary Material.</w:t>
+        <w:t xml:space="preserve">The manuscript builds on bridge weigh-in-motion work published in this journal, including the review by Yu, Cai and Deng (2016), and cites recent studies in the journal on vehicle-weight identification (Hao et al., 2019; Zuo et al., 2019) and on influence-line identification and model updating (Lin et al., 2023; Wang et al., 2026). It is about 11,000 word-equivalents with 7 figures and 4 tables; derivations, full field tables and the error budget are in the Supplementary Material.</w:t>
       </w:r>
     </w:p>
     <w:p>

</xml_diff>

<commit_message>
ASE: figure captions updated for redrawn figures; Supplementary figures and tables renumbered in order of first citation; cover-letter word-equivalents updated
Co-Authored-By: Claude Opus 5.5 <noreply@anthropic.com>
Claude-Session: https://claude.ai/code/session_01B18ehnY6ZEjmwZNzrTta57
</commit_message>
<xml_diff>
--- a/manuscript/ase/word/Cover_Letter_ASE.docx
+++ b/manuscript/ase/word/Cover_Letter_ASE.docx
@@ -120,7 +120,7 @@
         <w:pStyle w:val="BodyText"/>
       </w:pPr>
       <w:r>
-        <w:t xml:space="preserve">a closed-form catalog of blind loci for five channel types on two- and three-span and haunched girders, with indicators that need no reference rigidity, showing that strain gauges are blind at every zero of the uniform-load moment and nearly blind in a band that can contain gauges set back from the piers;</w:t>
+        <w:t xml:space="preserve">a closed-form catalog of blind loci for five channel types on prismatic two- and three-span girders, with a strain criterion that also holds for haunched girders and indicators that need no reference rigidity, showing that strain gauges are blind at every zero of the uniform-load moment and nearly blind in a band that can contain gauges set back from the piers;</w:t>
       </w:r>
     </w:p>
     <w:p>
@@ -132,7 +132,7 @@
         <w:pStyle w:val="BodyText"/>
       </w:pPr>
       <w:r>
-        <w:t xml:space="preserve">a placement rule, optimal sensors at the extremes of the uniform-load response, together with a field finding from public moving-truck records that weighting gauges by their vehicle-free noise covariance raises the out-of-sample error above that of a plain gauge average;</w:t>
+        <w:t xml:space="preserve">a placement rule from extreme-point optimal design, optimal sensors at the extremes of the uniform-load response for position-independent noise, together with a field finding from one day of public moving-truck records that weighting gauges by their vehicle-free noise covariance raises the out-of-sample error above that of a plain gauge average;</w:t>
       </w:r>
     </w:p>
     <w:p>
@@ -144,7 +144,7 @@
         <w:pStyle w:val="BodyText"/>
       </w:pPr>
       <w:r>
-        <w:t xml:space="preserve">an identifiability analysis under uncertain pier stiffness, in which the constant follows a linear-fractional (Möbius) law, applied to an in-service 55 + 90 + 55 m box girder: its side-span deflection constant is not identifiable from static acceptance data, the main-span constant is, and a pier tiltmeter is the most informative additional measurement.</w:t>
+        <w:t xml:space="preserve">an identifiability analysis under uncertain pier stiffness, in which, for a symmetric girder with equal piers, the constant follows a linear-fractional (Möbius) law, applied to an in-service 55 + 90 + 55 m box girder: static acceptance data leave its side-span deflection constant uncertain by a factor of up to 6.6 but bound the main-span constant within a factor of 1.5, and a pier tiltmeter is the most informative additional measurement.</w:t>
       </w:r>
     </w:p>
     <w:p>
@@ -160,7 +160,7 @@
         <w:pStyle w:val="BodyText"/>
       </w:pPr>
       <w:r>
-        <w:t xml:space="preserve">The manuscript builds on bridge weigh-in-motion work published in this journal, including the review by Yu, Cai and Deng (2016), and cites recent studies in the journal on vehicle-weight identification (Hao et al., 2019; Zuo et al., 2019) and on influence-line identification and model updating (Lin et al., 2023; Wang et al., 2026). It is about 11,000 word-equivalents with 7 figures and 4 tables; derivations, full field tables and the error budget are in the Supplementary Material.</w:t>
+        <w:t xml:space="preserve">The manuscript builds on bridge weigh-in-motion work published in this journal, including the review by Yu et al. (2016), and cites recent studies in the journal on vehicle-weight identification (Hao et al., 2019; Zuo et al., 2019) and on influence-line identification and model updating (Lin et al., 2023; Wang et al., 2026). It is about 11,000 word-equivalents with 7 figures and 4 tables; derivations, full field tables and the error budget are in the Supplementary Material.</w:t>
       </w:r>
     </w:p>
     <w:p>

</xml_diff>

<commit_message>
ASE: final blind-read fixes (symbol k and n clashes, design pier stiffness wording, influence-area identity, split sentence, contribution (ii), cover-letter items); Fig. S4 redrawn; status docs
Co-Authored-By: Claude Opus 5.5 <noreply@anthropic.com>
Claude-Session: https://claude.ai/code/session_01B18ehnY6ZEjmwZNzrTta57
</commit_message>
<xml_diff>
--- a/manuscript/ase/word/Cover_Letter_ASE.docx
+++ b/manuscript/ase/word/Cover_Letter_ASE.docx
@@ -132,7 +132,7 @@
         <w:pStyle w:val="BodyText"/>
       </w:pPr>
       <w:r>
-        <w:t xml:space="preserve">a placement rule from extreme-point optimal design, optimal sensors at the extremes of the uniform-load response for position-independent noise, together with a field finding from one day of public moving-truck records that weighting gauges by their vehicle-free noise covariance raises the out-of-sample error above that of a plain gauge average;</w:t>
+        <w:t xml:space="preserve">a placement rule from extreme-point optimal design: for position-independent noise, optimal sensors lie at the extremes of the uniform-load response. On one day of public moving-truck records, weighting gauges by their vehicle-free noise covariance raised the out-of-sample error above that of a plain gauge average;</w:t>
       </w:r>
     </w:p>
     <w:p>
@@ -144,7 +144,7 @@
         <w:pStyle w:val="BodyText"/>
       </w:pPr>
       <w:r>
-        <w:t xml:space="preserve">an identifiability analysis under uncertain pier stiffness, in which, for a symmetric girder with equal piers, the constant follows a linear-fractional (Möbius) law, applied to an in-service 55 + 90 + 55 m box girder: static acceptance data leave its side-span deflection constant uncertain by a factor of up to 6.6 but bound the main-span constant within a factor of 1.5, and a pier tiltmeter is the most informative additional measurement.</w:t>
+        <w:t xml:space="preserve">an identifiability analysis under uncertain pier stiffness. For a symmetric girder with equal piers, the constant follows a linear-fractional (Möbius) law. On an in-service 55 + 90 + 55 m box girder, static acceptance data leave its side-span deflection constant uncertain by a factor of up to 6.6 but bound the main-span constant within a factor of 1.5, and a pier tiltmeter is the most informative additional measurement.</w:t>
       </w:r>
     </w:p>
     <w:p>

</xml_diff>

<commit_message>
ASE Gate-4 revision: 6.6/2.4/1.5 statement, readability restructuring (abstract 161 words, equations to S2, conclusions-first paragraphs, symbols table), new Supplementary tables (threshold sensitivity, axle positions, tolerance results), scope and caption fixes, new title; text trimmed to stay under 12,000 word-equivalents; README and run_all updated
Co-Authored-By: Claude Opus 5.5 <noreply@anthropic.com>
Claude-Session: https://claude.ai/code/session_01B18ehnY6ZEjmwZNzrTta57
</commit_message>
<xml_diff>
--- a/manuscript/ase/word/Cover_Letter_ASE.docx
+++ b/manuscript/ase/word/Cover_Letter_ASE.docx
@@ -72,7 +72,7 @@
           <w:bCs/>
           <w:b/>
         </w:rPr>
-        <w:t xml:space="preserve">Observability and sensor layout for influence-area load monitoring of continuous girder bridges</w:t>
+        <w:t xml:space="preserve">Blind loci and sensor layout for influence-area bridge weigh-in-motion on continuous girders</w:t>
       </w:r>
       <w:r>
         <w:rPr>
@@ -120,7 +120,7 @@
         <w:pStyle w:val="BodyText"/>
       </w:pPr>
       <w:r>
-        <w:t xml:space="preserve">a closed-form catalog of blind loci for five channel types on prismatic two- and three-span girders, with a strain criterion that also holds for haunched girders and indicators that need no reference rigidity, showing that strain gauges are blind at every zero of the uniform-load moment and nearly blind in a band that can contain gauges set back from the piers;</w:t>
+        <w:t xml:space="preserve">a closed-form catalog of blind loci for five channel types on prismatic two- and three-span girders, with a strain criterion that also holds for haunched girders and indicators that need no reference rigidity, showing that strain gauges that measure global bending (on a girder flange or web) are blind at every zero of the uniform-load moment and nearly blind in a band that can contain gauges set back from the piers;</w:t>
       </w:r>
     </w:p>
     <w:p>
@@ -144,7 +144,7 @@
         <w:pStyle w:val="BodyText"/>
       </w:pPr>
       <w:r>
-        <w:t xml:space="preserve">an identifiability analysis under uncertain pier stiffness. For a symmetric girder with equal piers, the constant follows a linear-fractional (Möbius) law. On an in-service 55 + 90 + 55 m box girder, static acceptance data leave its side-span deflection constant uncertain by a factor of up to 6.6 but bound the main-span constant within a factor of 1.5, and a pier tiltmeter is the most informative additional measurement.</w:t>
+        <w:t xml:space="preserve">an identifiability analysis under uncertain pier stiffness. For a symmetric girder with equal piers, the constant follows a linear-fractional (Möbius) law. On an in-service 55 + 90 + 55 m box girder, two static readings leave its side-span deflection constant uncertain by a factor of 6.6 from the static data alone (tolerance 5.3 %), 2.4 for plausible rigidity (girder rigidity 0.9–1.3 times design), against 1.5 for the main-span constant, and a pier tiltmeter is the most informative additional measurement.</w:t>
       </w:r>
     </w:p>
     <w:p>
@@ -160,7 +160,7 @@
         <w:pStyle w:val="BodyText"/>
       </w:pPr>
       <w:r>
-        <w:t xml:space="preserve">The manuscript builds on bridge weigh-in-motion work published in this journal, including the review by Yu et al. (2016), and cites recent studies in the journal on vehicle-weight identification (Hao et al., 2019; Zuo et al., 2019) and on influence-line identification and model updating (Lin et al., 2023; Wang et al., 2026). It is about 11,600 word-equivalents with 7 figures and 4 tables; derivations, full field tables and the error budget are in the Supplementary Material.</w:t>
+        <w:t xml:space="preserve">The manuscript builds on bridge weigh-in-motion work published in this journal, including the review by Yu et al. (2016), and cites recent studies in the journal on vehicle-weight identification (Hao et al., 2019; Zuo et al., 2019) and on influence-line identification and model updating (Lin et al., 2023; Wang et al., 2026). It is about 11,900 word-equivalents with 7 figures and 4 tables; derivations, full field tables and the error budget are in the Supplementary Material.</w:t>
       </w:r>
     </w:p>
     <w:p>

</xml_diff>

<commit_message>
ASE: apply Gate-4 round-2 residual fixes
Pair the side-span factors under the same conditions (6.6 vs 1.5 with
free rigidity; 2.4 vs 1.1 with rigidity bounded to 0.9-1.3), add C7 to
Table S13 (ident_static.py now logs C7), scope the abstract's last
sentence and Section 6 to the surveyed girder, move the tolerance
derivation to S8, clarify span-wise normalization in Figs 3 and 6,
unify the pier-rotation pattern name, and stay under 12,000
word-equivalents. Record round-2 editor reports.

Co-Authored-By: Claude Opus 5.5 <noreply@anthropic.com>
Claude-Session: https://claude.ai/code/session_01B18ehnY6ZEjmwZNzrTta57
</commit_message>
<xml_diff>
--- a/manuscript/ase/word/Cover_Letter_ASE.docx
+++ b/manuscript/ase/word/Cover_Letter_ASE.docx
@@ -144,7 +144,7 @@
         <w:pStyle w:val="BodyText"/>
       </w:pPr>
       <w:r>
-        <w:t xml:space="preserve">an identifiability analysis under uncertain pier stiffness. For a symmetric girder with equal piers, the constant follows a linear-fractional (Möbius) law. On an in-service 55 + 90 + 55 m box girder, two static readings leave its side-span deflection constant uncertain by a factor of 6.6 from the static data alone (tolerance 5.3 %), 2.4 for plausible rigidity (girder rigidity 0.9–1.3 times design), against 1.5 for the main-span constant, and a pier tiltmeter is the most informative additional measurement.</w:t>
+        <w:t xml:space="preserve">an identifiability analysis under uncertain pier stiffness. For a symmetric girder with equal piers, the constant follows a linear-fractional (Möbius) law. On an in-service 55 + 90 + 55 m box girder, two static readings leave its side-span deflection constant uncertain by a factor of 6.6 against 1.5 for the main-span constant from the static data alone, or 2.4 against 1.1 with girder rigidity bounded to 0.9–1.3 times design, and a pier tiltmeter is the most informative additional measurement.</w:t>
       </w:r>
     </w:p>
     <w:p>
@@ -160,7 +160,7 @@
         <w:pStyle w:val="BodyText"/>
       </w:pPr>
       <w:r>
-        <w:t xml:space="preserve">The manuscript builds on bridge weigh-in-motion work published in this journal, including the review by Yu et al. (2016), and cites recent studies in the journal on vehicle-weight identification (Hao et al., 2019; Zuo et al., 2019) and on influence-line identification and model updating (Lin et al., 2023; Wang et al., 2026). It is about 11,900 word-equivalents with 7 figures and 4 tables; derivations, full field tables and the error budget are in the Supplementary Material.</w:t>
+        <w:t xml:space="preserve">The manuscript builds on bridge weigh-in-motion work published in this journal, including the review by Yu et al. (2016), and cites recent studies in the journal on vehicle-weight identification (Hao et al., 2019; Zuo et al., 2019) and on influence-line identification and model updating (Lin et al., 2023; Wang et al., 2026). It is just under 12,000 word-equivalents with 7 figures and 5 tables; derivations, full field tables and the error budget are in the Supplementary Material.</w:t>
       </w:r>
     </w:p>
     <w:p>

</xml_diff>

<commit_message>
ASE: apply hostile audit v2 fixes
Correct the deflection blind-locus claim (main span of three nearly
equal spans is blind for 0.9647 <= beta < 1.2247), the Fig. 6 and
Fig. 3 caption notes, scope of the abstract and contribution (ii), two
rounding errors in Tables S13/S17; mark 6.6 as base model and give the
variant range; add five verified references; italicize journal and book
titles; move Table 4 to Table S19; base-model rows in Tables 3/S15;
fill Table S9 day-1 correlations; fix PDF rendering of operator-only
scripts, bars and overbars; number Eqs. (S1)-(S2); keep units on line.

Co-Authored-By: Claude Opus 5.5 <noreply@anthropic.com>
Claude-Session: https://claude.ai/code/session_01B18ehnY6ZEjmwZNzrTta57
</commit_message>
<xml_diff>
--- a/manuscript/ase/word/Cover_Letter_ASE.docx
+++ b/manuscript/ase/word/Cover_Letter_ASE.docx
@@ -120,7 +120,7 @@
         <w:pStyle w:val="BodyText"/>
       </w:pPr>
       <w:r>
-        <w:t xml:space="preserve">a closed-form catalog of blind loci for five channel types on prismatic two- and three-span girders, with a strain criterion that also holds for haunched girders and indicators that need no reference rigidity, showing that strain gauges that measure global bending (on a girder flange or web) are blind at every zero of the uniform-load moment and nearly blind in a band that can contain gauges set back from the piers;</w:t>
+        <w:t xml:space="preserve">a closed-form catalog of blind loci for five channel types on prismatic two- and three-span girders, with a strain criterion that also holds for haunched girders and strain and cancellation indicators that need no reference rigidity, showing that strain gauges that measure global bending (on a girder flange or web) are blind at every zero of the uniform-load moment and nearly blind in a band that can contain gauges set back from the piers;</w:t>
       </w:r>
     </w:p>
     <w:p>
@@ -144,7 +144,7 @@
         <w:pStyle w:val="BodyText"/>
       </w:pPr>
       <w:r>
-        <w:t xml:space="preserve">an identifiability analysis under uncertain pier stiffness. For a symmetric girder with equal piers, the constant follows a linear-fractional (Möbius) law. On an in-service 55 + 90 + 55 m box girder, two static readings leave its side-span deflection constant uncertain by a factor of 6.6 against 1.5 for the main-span constant from the static data alone, or 2.4 against 1.1 with girder rigidity bounded to 0.9–1.3 times design, and a pier tiltmeter is the most informative additional measurement.</w:t>
+        <w:t xml:space="preserve">an identifiability analysis under uncertain pier stiffness. For a symmetric girder with equal piers, the constant follows a linear-fractional (Möbius) law. On an in-service 55 + 90 + 55 m box girder, two static readings leave its side-span deflection constant uncertain by a factor of 6.6 against 1.5 for the main-span constant from the static data alone, or 2.4 against 1.1 with girder rigidity bounded to 0.9–1.3 times design, and, at the design pier stiffness, a pier tiltmeter is the most informative of the additional measurements compared.</w:t>
       </w:r>
     </w:p>
     <w:p>
@@ -160,7 +160,7 @@
         <w:pStyle w:val="BodyText"/>
       </w:pPr>
       <w:r>
-        <w:t xml:space="preserve">The manuscript builds on bridge weigh-in-motion work published in this journal, including the review by Yu et al. (2016), and cites recent studies in the journal on vehicle-weight identification (Hao et al., 2019; Zuo et al., 2019) and on influence-line identification and model updating (Lin et al., 2023; Wang et al., 2026). It is just under 12,000 word-equivalents with 7 figures and 5 tables; derivations, full field tables and the error budget are in the Supplementary Material.</w:t>
+        <w:t xml:space="preserve">The manuscript builds on bridge weigh-in-motion work published in this journal, including the review by Yu et al. (2016) and BWIM on a two-span continuous bridge (Yamaguchi et al., 2009), and cites recent studies in the journal on vehicle-weight identification (Hao et al., 2019; Zuo et al., 2019) and on influence-line identification and model updating (Lin et al., 2023; Wang et al., 2026). It is just under 12,000 word-equivalents with 7 figures, 3 numbered tables and a table of symbols; derivations, full field tables and the error budget are in the Supplementary Material.</w:t>
       </w:r>
     </w:p>
     <w:p>
@@ -207,7 +207,7 @@
         <w:pStyle w:val="BodyText"/>
       </w:pPr>
       <w:r>
-        <w:t xml:space="preserve">Yours sincerely,</w:t>
+        <w:t xml:space="preserve">Sincerely,</w:t>
       </w:r>
     </w:p>
     <w:p>

</xml_diff>

<commit_message>
ASE: rewrite abstract, contributions and conclusions around three main results; new title; minor audit fixes
- Abstract, Introduction contribution paragraph and Conclusions state the three
  main results and that the contribution is design criteria, not a new weighing method
- Title: Blind spots and sensor placement for influence-area weigh-in-motion on continuous girders
- Table S1 completed; S3 shift range 2-160 m; upright math subscripts in PDF
- Figures 1, 2, S8, S12, S16, S17 and graphical abstract redrawn (Inter font, legends moved)
- Blind-read rounds 13-14 fixes; cover letter dated 21 October 2026

Co-Authored-By: Claude Opus 5.5 <noreply@anthropic.com>
Claude-Session: https://claude.ai/code/session_01MSqiFEviRg6WLXKJLTnixZ
</commit_message>
<xml_diff>
--- a/manuscript/ase/word/Cover_Letter_ASE.docx
+++ b/manuscript/ase/word/Cover_Letter_ASE.docx
@@ -7,7 +7,7 @@
         <w:pStyle w:val="FirstParagraph"/>
       </w:pPr>
       <w:r>
-        <w:t xml:space="preserve">20 October 2026</w:t>
+        <w:t xml:space="preserve">21 October 2026</w:t>
       </w:r>
     </w:p>
     <w:p>
@@ -72,7 +72,7 @@
           <w:bCs/>
           <w:b/>
         </w:rPr>
-        <w:t xml:space="preserve">Blind loci and sensor layout for influence-area bridge weigh-in-motion on continuous girders</w:t>
+        <w:t xml:space="preserve">Blind spots and sensor placement for influence-area weigh-in-motion on continuous girders</w:t>
       </w:r>
       <w:r>
         <w:rPr>
@@ -120,7 +120,7 @@
         <w:pStyle w:val="BodyText"/>
       </w:pPr>
       <w:r>
-        <w:t xml:space="preserve">a closed-form catalog of blind loci for five channel types on prismatic two- and three-span girders, with a strain criterion that also holds for haunched girders, and with strain and cancellation indicators that need no reference rigidity, showing that strain gauges that measure global bending (on a girder flange or web) are blind at every zero of the uniform-load moment and nearly blind in a band that can contain gauges set back from the piers;</w:t>
+        <w:t xml:space="preserve">a closed-form catalog of blind loci for five channel types on prismatic two- and three-span girders. It shows that strain gauges that measure global bending (on a girder flange or web) are blind at every zero of the uniform-load moment and nearly blind in a band that can contain gauges set back from the piers. The strain criterion also holds for haunched girders, and the strain and cancellation indicators need no reference rigidity;</w:t>
       </w:r>
     </w:p>
     <w:p>
@@ -160,7 +160,7 @@
         <w:pStyle w:val="BodyText"/>
       </w:pPr>
       <w:r>
-        <w:t xml:space="preserve">The manuscript builds on bridge weigh-in-motion work published in this journal, including the review by Yu et al. (2016) and BWIM on a two-span continuous bridge (Yamaguchi et al., 2009), and cites recent studies in the journal on vehicle-weight identification (Hao et al., 2019; Zuo et al., 2019) and on influence-line identification and model updating (Lin et al., 2023; Wang et al., 2026). It is just under 12,000 word-equivalents with 7 figures, 3 numbered tables and a table of symbols; derivations, full field tables and the error budget are in the Supplementary Material.</w:t>
+        <w:t xml:space="preserve">The manuscript builds on bridge weigh-in-motion work published in this journal, including the review by Yu et al. (2016) and BWIM on a two-span continuous bridge (Yamaguchi et al., 2009), and cites recent studies in the journal on vehicle-weight identification (Hao et al., 2019; Zuo et al., 2019) and on influence-line identification and model updating (Lin et al., 2023; Wang et al., 2026). It is just under 12 000 word-equivalents with 7 figures, 3 numbered tables and a table of symbols; derivations, full field tables and the error budget are in the Supplementary Material.</w:t>
       </w:r>
     </w:p>
     <w:p>

</xml_diff>

<commit_message>
ASE: blind-read rounds 15-16 fixes; Giẽ bridge name; trim to 11 975 word-equivalents
Co-Authored-By: Claude Opus 5.5 <noreply@anthropic.com>
Claude-Session: https://claude.ai/code/session_01MSqiFEviRg6WLXKJLTnixZ
</commit_message>
<xml_diff>
--- a/manuscript/ase/word/Cover_Letter_ASE.docx
+++ b/manuscript/ase/word/Cover_Letter_ASE.docx
@@ -120,7 +120,7 @@
         <w:pStyle w:val="BodyText"/>
       </w:pPr>
       <w:r>
-        <w:t xml:space="preserve">a closed-form catalog of blind loci for five channel types on prismatic two- and three-span girders. It shows that strain gauges that measure global bending (on a girder flange or web) are blind at every zero of the uniform-load moment and nearly blind in a band that can contain gauges set back from the piers. The strain criterion also holds for haunched girders, and the strain and cancellation indicators need no reference rigidity;</w:t>
+        <w:t xml:space="preserve">A closed-form catalog of blind loci for five channel types on prismatic two- and three-span girders. It shows that strain gauges that measure global bending (on a girder flange or web) are blind at every zero of the uniform-load moment and nearly blind in a band that can contain gauges set back from the piers. The strain criterion also holds for haunched girders, and the strain and cancellation indicators need no reference rigidity.</w:t>
       </w:r>
     </w:p>
     <w:p>
@@ -132,7 +132,7 @@
         <w:pStyle w:val="BodyText"/>
       </w:pPr>
       <w:r>
-        <w:t xml:space="preserve">a placement rule from extreme-point optimal design: for position-independent noise, optimal sensors lie at the extremes of the uniform-load response. On one day of public moving-truck records, weighting gauges by their vehicle-free noise covariance raised the out-of-sample error above that of a plain gauge average;</w:t>
+        <w:t xml:space="preserve">A placement rule from extreme-point optimal design: for position-independent noise, optimal sensors lie at the extremes of the uniform-load response. On one day of public moving-truck records, weighting gauges by their vehicle-free noise covariance raised the out-of-sample error above that of a plain gauge average.</w:t>
       </w:r>
     </w:p>
     <w:p>
@@ -144,7 +144,7 @@
         <w:pStyle w:val="BodyText"/>
       </w:pPr>
       <w:r>
-        <w:t xml:space="preserve">an identifiability analysis under uncertain pier stiffness. For a symmetric girder with equal piers, the constant follows a linear-fractional (Möbius) law. On an in-service 55 + 90 + 55 m box girder, two static readings leave its side-span deflection constant uncertain by a factor of 6.6 against 1.5 for the main-span constant from the static data alone, or 2.4 against 1.1 with girder rigidity bounded to 0.9–1.3 times design, and, at the design pier stiffness, a pier tiltmeter is the most informative of the additional measurements compared.</w:t>
+        <w:t xml:space="preserve">An identifiability analysis under uncertain pier stiffness. For a symmetric girder with equal piers, the constant follows a linear-fractional (Möbius) law. On an in-service 55 + 90 + 55 m box girder, two static readings leave its side-span deflection constant uncertain by a factor of 6.6 against 1.5 for the main-span constant from the static data alone, or 2.4 against 1.1 with girder rigidity bounded to 0.9–1.3 times design. At the design pier stiffness, a pier tiltmeter is the most informative of the additional measurements compared.</w:t>
       </w:r>
     </w:p>
     <w:p>

</xml_diff>

<commit_message>
ASE cover letter: no mention of other papers; 'times the design value'
Co-Authored-By: Claude Opus 5.5 <noreply@anthropic.com>
Claude-Session: https://claude.ai/code/session_01MSqiFEviRg6WLXKJLTnixZ
</commit_message>
<xml_diff>
--- a/manuscript/ase/word/Cover_Letter_ASE.docx
+++ b/manuscript/ase/word/Cover_Letter_ASE.docx
@@ -144,7 +144,7 @@
         <w:pStyle w:val="BodyText"/>
       </w:pPr>
       <w:r>
-        <w:t xml:space="preserve">An identifiability analysis under uncertain pier stiffness. For a symmetric girder with equal piers, the constant follows a linear-fractional (Möbius) law. On an in-service 55 + 90 + 55 m box girder, two static readings leave its side-span deflection constant uncertain by a factor of 6.6 against 1.5 for the main-span constant from the static data alone, or 2.4 against 1.1 with girder rigidity bounded to 0.9–1.3 times design. At the design pier stiffness, a pier tiltmeter is the most informative of the additional measurements compared.</w:t>
+        <w:t xml:space="preserve">An identifiability analysis under uncertain pier stiffness. For a symmetric girder with equal piers, the constant follows a linear-fractional (Möbius) law. On an in-service 55 + 90 + 55 m box girder, two static readings leave its side-span deflection constant uncertain by a factor of 6.6 against 1.5 for the main-span constant from the static data alone, or 2.4 against 1.1 with girder rigidity bounded to 0.9–1.3 times the design value. At the design pier stiffness, a pier tiltmeter is the most informative of the additional measurements compared.</w:t>
       </w:r>
     </w:p>
     <w:p>
@@ -160,7 +160,7 @@
         <w:pStyle w:val="BodyText"/>
       </w:pPr>
       <w:r>
-        <w:t xml:space="preserve">The manuscript builds on bridge weigh-in-motion work published in this journal, including the review by Yu et al. (2016) and BWIM on a two-span continuous bridge (Yamaguchi et al., 2009), and cites recent studies in the journal on vehicle-weight identification (Hao et al., 2019; Zuo et al., 2019) and on influence-line identification and model updating (Lin et al., 2023; Wang et al., 2026). It is just under 12 000 word-equivalents with 7 figures, 3 numbered tables and a table of symbols; derivations, full field tables and the error budget are in the Supplementary Material.</w:t>
+        <w:t xml:space="preserve">The manuscript is just under 12 000 word-equivalents with 7 figures, 3 numbered tables and a table of symbols; derivations, full field tables and the error budget are in the Supplementary Material.</w:t>
       </w:r>
     </w:p>
     <w:p>
@@ -186,20 +186,7 @@
         <w:pStyle w:val="BodyText"/>
       </w:pPr>
       <w:r>
-        <w:t xml:space="preserve">The manuscript is original, has not been published, and is not under consideration by any other journal. Two other papers by the authors are under review at</w:t>
-      </w:r>
-      <w:r>
-        <w:t xml:space="preserve"> </w:t>
-      </w:r>
-      <w:r>
-        <w:rPr>
-          <w:iCs/>
-          <w:i/>
-        </w:rPr>
-        <w:t xml:space="preserve">Structures</w:t>
-      </w:r>
-      <w:r>
-        <w:t xml:space="preserve">; they address different problems and share no data, test rig or text with this manuscript. All authors have approved the submission. Conflicts of interest, funding and the use of generative AI are declared in the manuscript.</w:t>
+        <w:t xml:space="preserve">The manuscript is original, has not been published, and is not under consideration by any other journal. All authors have approved the submission. Conflicts of interest, funding and the use of generative AI are declared in the manuscript.</w:t>
       </w:r>
     </w:p>
     <w:p>

</xml_diff>

<commit_message>
Hostile audit v3 fixes: PDF delimiters, cover-letter address alignment, dangling 'Such criteria', reference initials and italics, page layout, upright d, app.xml, scripts.zip process traces
Co-Authored-By: Claude Opus 5.5 <noreply@anthropic.com>
Claude-Session: https://claude.ai/code/session_01MSqiFEviRg6WLXKJLTnixZ
</commit_message>
<xml_diff>
--- a/manuscript/ase/word/Cover_Letter_ASE.docx
+++ b/manuscript/ase/word/Cover_Letter_ASE.docx
@@ -13,6 +13,7 @@
     <w:p>
       <w:pPr>
         <w:pStyle w:val="BodyText"/>
+        <w:jc w:val="left"/>
       </w:pPr>
       <w:r>
         <w:t xml:space="preserve">The Editors-in-Chief</w:t>
@@ -144,7 +145,7 @@
         <w:pStyle w:val="BodyText"/>
       </w:pPr>
       <w:r>
-        <w:t xml:space="preserve">An identifiability analysis under uncertain pier stiffness. For a symmetric girder with equal piers, the constant follows a linear-fractional (Möbius) law. On an in-service 55 + 90 + 55 m box girder, two static readings leave its side-span deflection constant uncertain by a factor of 6.6 against 1.5 for the main-span constant from the static data alone, or 2.4 against 1.1 with girder rigidity bounded to 0.9–1.3 times the design value. At the design pier stiffness, a pier tiltmeter is the most informative of the additional measurements compared.</w:t>
+        <w:t xml:space="preserve">An identifiability analysis under uncertain pier stiffness. For a symmetric girder with equal piers, the constant follows a linear-fractional (Möbius) law. On an in-service 55 + 90 + 55 m box girder, two static readings leave its side-span deflection constant uncertain by a factor of 6.6 against 1.5 for the main-span constant from the static data alone, or 2.4 against 1.1 with girder rigidity bounded to 0.9–1.3 times the design value. At the design pier stiffness, a pier tiltmeter is the most informative of the additional measurements compared.</w:t>
       </w:r>
     </w:p>
     <w:p>
@@ -178,7 +179,7 @@
         <w:t xml:space="preserve"> </w:t>
       </w:r>
       <w:r>
-        <w:t xml:space="preserve">The field strain records are from the public NOR-BWIM dataset (figshare, https://doi.org/10.7294/26880898.v1, CC0 license). The laboratory data, the processed data of the in-service bridge, the derived data behind every figure and table, and all analysis scripts with their console output are provided as Supplementary Material.</w:t>
+        <w:t xml:space="preserve">The field strain records are from the public NOR-BWIM dataset (figshare, https://doi.org/10.7294/26880898.v1, CC0 license). The laboratory data, the processed data of the in-service bridge, the derived data behind the figures and tables, and all analysis scripts with their console output are provided as Supplementary Material.</w:t>
       </w:r>
     </w:p>
     <w:p>
@@ -200,9 +201,10 @@
     <w:p>
       <w:pPr>
         <w:pStyle w:val="BodyText"/>
-      </w:pPr>
-      <w:r>
-        <w:t xml:space="preserve">Thai-Son Vu (corresponding author)</w:t>
+        <w:jc w:val="left"/>
+      </w:pPr>
+      <w:r>
+        <w:t xml:space="preserve">Thai-Son Vu (corresponding author), on behalf of both authors</w:t>
       </w:r>
       <w:r>
         <w:br/>
@@ -221,14 +223,6 @@
       </w:r>
       <w:r>
         <w:t xml:space="preserve">E-mail: sonvt2@huce.edu.vn</w:t>
-      </w:r>
-    </w:p>
-    <w:p>
-      <w:pPr>
-        <w:pStyle w:val="BodyText"/>
-      </w:pPr>
-      <w:r>
-        <w:t xml:space="preserve">on behalf of Quoc-Bao Nguyen</w:t>
       </w:r>
     </w:p>
     <w:sectPr>

</xml_diff>

<commit_message>
Cover letter rewritten to one page per rule VI.1; 'nearly blind at'; single spacing for the letter
Co-Authored-By: Claude Opus 5.5 <noreply@anthropic.com>
Claude-Session: https://claude.ai/code/session_01MSqiFEviRg6WLXKJLTnixZ
</commit_message>
<xml_diff>
--- a/manuscript/ase/word/Cover_Letter_ASE.docx
+++ b/manuscript/ase/word/Cover_Letter_ASE.docx
@@ -5,6 +5,7 @@
     <w:p>
       <w:pPr>
         <w:pStyle w:val="FirstParagraph"/>
+        <w:spacing w:line="240" w:lineRule="auto" w:after="120" w:before="0"/>
       </w:pPr>
       <w:r>
         <w:t xml:space="preserve">21 October 2026</w:t>
@@ -13,6 +14,7 @@
     <w:p>
       <w:pPr>
         <w:pStyle w:val="BodyText"/>
+        <w:spacing w:line="240" w:lineRule="auto" w:after="120" w:before="0"/>
         <w:jc w:val="left"/>
       </w:pPr>
       <w:r>
@@ -38,6 +40,7 @@
     <w:p>
       <w:pPr>
         <w:pStyle w:val="BodyText"/>
+        <w:spacing w:line="240" w:lineRule="auto" w:after="120" w:before="0"/>
       </w:pPr>
       <w:r>
         <w:t xml:space="preserve">Dear Editors,</w:t>
@@ -46,6 +49,7 @@
     <w:p>
       <w:pPr>
         <w:pStyle w:val="BodyText"/>
+        <w:spacing w:line="240" w:lineRule="auto" w:after="120" w:before="0"/>
       </w:pPr>
       <w:r>
         <w:rPr>
@@ -86,6 +90,7 @@
     <w:p>
       <w:pPr>
         <w:pStyle w:val="BodyText"/>
+        <w:spacing w:line="240" w:lineRule="auto" w:after="120" w:before="0"/>
       </w:pPr>
       <w:r>
         <w:t xml:space="preserve">We submit the above manuscript for consideration as an Original Research Article in</w:t>
@@ -101,72 +106,58 @@
         <w:t xml:space="preserve">Advances in Structural Engineering</w:t>
       </w:r>
       <w:r>
-        <w:t xml:space="preserve">. It falls within the journal’s focus on structural health monitoring for performance assessment of bridges.</w:t>
+        <w:t xml:space="preserve">.</w:t>
       </w:r>
     </w:p>
     <w:p>
       <w:pPr>
         <w:pStyle w:val="BodyText"/>
-      </w:pPr>
-      <w:r>
-        <w:t xml:space="preserve">Monitoring the loads that a bridge actually carries is often done with few channels, by integrating one response record and dividing by a calibration constant. On continuous girders this constant can vanish, because influence lines change sign over the piers. The manuscript gives structural engineers criteria for choosing, before installation, channels and positions that observe the load, and for judging whether their constant can be trusted when the pier stiffness is uncertain. The underlying identity and the generalized least-squares estimator are classical, and the manuscript says so; the contributions are the criteria built on them:</w:t>
+        <w:spacing w:line="240" w:lineRule="auto" w:after="120" w:before="0"/>
+      </w:pPr>
+      <w:r>
+        <w:t xml:space="preserve">Influence-area weighing divides the area under one bridge response record by an integral constant to estimate the gross weight. On continuous girders this constant can vanish, because influence lines change sign over the piers, and engineers have had no criterion for telling, before installation, which channels and positions can weigh.</w:t>
       </w:r>
     </w:p>
     <w:p>
       <w:pPr>
-        <w:numPr>
-          <w:ilvl w:val="0"/>
-          <w:numId w:val="1001"/>
-        </w:numPr>
         <w:pStyle w:val="BodyText"/>
-      </w:pPr>
-      <w:r>
-        <w:t xml:space="preserve">A closed-form catalog of blind loci for five channel types on prismatic two- and three-span girders. It shows that strain gauges that measure global bending (on a girder flange or web) are blind at every zero of the uniform-load moment and nearly blind in a band that can contain gauges set back from the piers. The strain criterion also holds for haunched girders, and the strain and cancellation indicators need no reference rigidity.</w:t>
+        <w:spacing w:line="240" w:lineRule="auto" w:after="120" w:before="0"/>
+      </w:pPr>
+      <w:r>
+        <w:t xml:space="preserve">The manuscript gives such criteria. Closed forms locate the blind points of five channel types: strain gauges that measure global bending are blind at every zero of the uniform-load moment and nearly blind at 0.19–0.32 of the span from the interior support on two equal spans. For position-independent noise, optimal sensors lie at the extremes of the uniform-load response. The constant follows a linear-fractional law in pier stiffness; on an in-service 55 + 90 + 55 m box girder, two static readings leave the side-span deflection constant of the base model uncertain by a factor of 6.6 against 1.5 at mid-span of the main span (2.4 against 1.1 with girder rigidity bounded to 0.9–1.3 times the design value).</w:t>
       </w:r>
     </w:p>
     <w:p>
       <w:pPr>
-        <w:numPr>
-          <w:ilvl w:val="0"/>
-          <w:numId w:val="1001"/>
-        </w:numPr>
         <w:pStyle w:val="BodyText"/>
-      </w:pPr>
-      <w:r>
-        <w:t xml:space="preserve">A placement rule from extreme-point optimal design: for position-independent noise, optimal sensors lie at the extremes of the uniform-load response. On one day of public moving-truck records, weighting gauges by their vehicle-free noise covariance raised the out-of-sample error above that of a plain gauge average.</w:t>
+        <w:spacing w:line="240" w:lineRule="auto" w:after="120" w:before="0"/>
+      </w:pPr>
+      <w:r>
+        <w:t xml:space="preserve">The work fits the journal’s focus on structural health monitoring for performance assessment of bridges: it tells engineers where to place the few channels that screen continuous bridges for overloads.</w:t>
       </w:r>
     </w:p>
     <w:p>
       <w:pPr>
-        <w:numPr>
-          <w:ilvl w:val="0"/>
-          <w:numId w:val="1001"/>
-        </w:numPr>
         <w:pStyle w:val="BodyText"/>
-      </w:pPr>
-      <w:r>
-        <w:t xml:space="preserve">An identifiability analysis under uncertain pier stiffness. For a symmetric girder with equal piers, the constant follows a linear-fractional (Möbius) law. On an in-service 55 + 90 + 55 m box girder, two static readings leave its side-span deflection constant uncertain by a factor of 6.6 against 1.5 for the main-span constant from the static data alone, or 2.4 against 1.1 with girder rigidity bounded to 0.9–1.3 times the design value. At the design pier stiffness, a pier tiltmeter is the most informative of the additional measurements compared.</w:t>
+        <w:spacing w:line="240" w:lineRule="auto" w:after="120" w:before="0"/>
+      </w:pPr>
+      <w:r>
+        <w:t xml:space="preserve">A laboratory test is consistent with the identity. The field records are used to check the assumptions behind the criteria; they cannot test weight discrimination, because their reference weights vary little, and the manuscript states this. The moving-load test of the in-service bridge is designed but not yet performed, and its predicted outcomes are given so that they can be checked.</w:t>
       </w:r>
     </w:p>
     <w:p>
       <w:pPr>
-        <w:pStyle w:val="FirstParagraph"/>
-      </w:pPr>
-      <w:r>
-        <w:t xml:space="preserve">A laboratory test is consistent with the identity. The field records are used to check the assumptions behind the criteria; they cannot test weight discrimination, because their reference weights vary little, and the manuscript states this. The moving-load test of the in-service bridge is designed but not yet performed, and its predicted outcomes are given so that they can be checked.</w:t>
+        <w:pStyle w:val="BodyText"/>
+        <w:spacing w:line="240" w:lineRule="auto" w:after="120" w:before="0"/>
+      </w:pPr>
+      <w:r>
+        <w:t xml:space="preserve">The manuscript is just under 12 000 word-equivalents with 7 figures, 3 numbered tables and a table of symbols; derivations, full field tables and the error budget are in the Supplementary Material.</w:t>
       </w:r>
     </w:p>
     <w:p>
       <w:pPr>
         <w:pStyle w:val="BodyText"/>
-      </w:pPr>
-      <w:r>
-        <w:t xml:space="preserve">The manuscript is just under 12 000 word-equivalents with 7 figures, 3 numbered tables and a table of symbols; derivations, full field tables and the error budget are in the Supplementary Material.</w:t>
-      </w:r>
-    </w:p>
-    <w:p>
-      <w:pPr>
-        <w:pStyle w:val="BodyText"/>
+        <w:spacing w:line="240" w:lineRule="auto" w:after="120" w:before="0"/>
       </w:pPr>
       <w:r>
         <w:rPr>
@@ -185,6 +176,7 @@
     <w:p>
       <w:pPr>
         <w:pStyle w:val="BodyText"/>
+        <w:spacing w:line="240" w:lineRule="auto" w:after="120" w:before="0"/>
       </w:pPr>
       <w:r>
         <w:t xml:space="preserve">The manuscript is original, has not been published, and is not under consideration by any other journal. All authors have approved the submission. Conflicts of interest, funding and the use of generative AI are declared in the manuscript.</w:t>
@@ -193,6 +185,7 @@
     <w:p>
       <w:pPr>
         <w:pStyle w:val="BodyText"/>
+        <w:spacing w:line="240" w:lineRule="auto" w:after="120" w:before="0"/>
       </w:pPr>
       <w:r>
         <w:t xml:space="preserve">Sincerely,</w:t>
@@ -201,6 +194,7 @@
     <w:p>
       <w:pPr>
         <w:pStyle w:val="BodyText"/>
+        <w:spacing w:line="240" w:lineRule="auto" w:after="120" w:before="0"/>
         <w:jc w:val="left"/>
       </w:pPr>
       <w:r>
@@ -352,123 +346,8 @@
       </w:pPr>
     </w:lvl>
   </w:abstractNum>
-  <w:abstractNum w:abstractNumId="99411">
-    <w:nsid w:val="A99411"/>
-    <w:multiLevelType w:val="multilevel"/>
-    <w:lvl w:ilvl="0">
-      <w:start w:val="1"/>
-      <w:numFmt w:val="decimal"/>
-      <w:lvlText w:val="%1."/>
-      <w:lvlJc w:val="left"/>
-      <w:pPr>
-        <w:ind w:left="720" w:hanging="480"/>
-      </w:pPr>
-    </w:lvl>
-    <w:lvl w:ilvl="1">
-      <w:start w:val="1"/>
-      <w:numFmt w:val="decimal"/>
-      <w:lvlText w:val="%2."/>
-      <w:lvlJc w:val="left"/>
-      <w:pPr>
-        <w:ind w:left="1440" w:hanging="480"/>
-      </w:pPr>
-    </w:lvl>
-    <w:lvl w:ilvl="2">
-      <w:start w:val="1"/>
-      <w:numFmt w:val="decimal"/>
-      <w:lvlText w:val="%3."/>
-      <w:lvlJc w:val="left"/>
-      <w:pPr>
-        <w:ind w:left="2160" w:hanging="480"/>
-      </w:pPr>
-    </w:lvl>
-    <w:lvl w:ilvl="3">
-      <w:start w:val="1"/>
-      <w:numFmt w:val="decimal"/>
-      <w:lvlText w:val="%4."/>
-      <w:lvlJc w:val="left"/>
-      <w:pPr>
-        <w:ind w:left="2880" w:hanging="480"/>
-      </w:pPr>
-    </w:lvl>
-    <w:lvl w:ilvl="4">
-      <w:start w:val="1"/>
-      <w:numFmt w:val="decimal"/>
-      <w:lvlText w:val="%5."/>
-      <w:lvlJc w:val="left"/>
-      <w:pPr>
-        <w:ind w:left="3600" w:hanging="480"/>
-      </w:pPr>
-    </w:lvl>
-    <w:lvl w:ilvl="5">
-      <w:start w:val="1"/>
-      <w:numFmt w:val="decimal"/>
-      <w:lvlText w:val="%6."/>
-      <w:lvlJc w:val="left"/>
-      <w:pPr>
-        <w:ind w:left="4320" w:hanging="480"/>
-      </w:pPr>
-    </w:lvl>
-    <w:lvl w:ilvl="6">
-      <w:start w:val="1"/>
-      <w:numFmt w:val="decimal"/>
-      <w:lvlText w:val="%7."/>
-      <w:lvlJc w:val="left"/>
-      <w:pPr>
-        <w:ind w:left="5040" w:hanging="480"/>
-      </w:pPr>
-    </w:lvl>
-    <w:lvl w:ilvl="7">
-      <w:start w:val="1"/>
-      <w:numFmt w:val="decimal"/>
-      <w:lvlText w:val="%8."/>
-      <w:lvlJc w:val="left"/>
-      <w:pPr>
-        <w:ind w:left="5760" w:hanging="480"/>
-      </w:pPr>
-    </w:lvl>
-    <w:lvl w:ilvl="8">
-      <w:start w:val="1"/>
-      <w:numFmt w:val="decimal"/>
-      <w:lvlText w:val="%9."/>
-      <w:lvlJc w:val="left"/>
-      <w:pPr>
-        <w:ind w:left="6480" w:hanging="480"/>
-      </w:pPr>
-    </w:lvl>
-  </w:abstractNum>
   <w:num w:numId="1000">
     <w:abstractNumId w:val="990"/>
-  </w:num>
-  <w:num w:numId="1001">
-    <w:abstractNumId w:val="99411"/>
-    <w:lvlOverride w:ilvl="0">
-      <w:startOverride w:val="1"/>
-    </w:lvlOverride>
-    <w:lvlOverride w:ilvl="1">
-      <w:startOverride w:val="1"/>
-    </w:lvlOverride>
-    <w:lvlOverride w:ilvl="2">
-      <w:startOverride w:val="1"/>
-    </w:lvlOverride>
-    <w:lvlOverride w:ilvl="3">
-      <w:startOverride w:val="1"/>
-    </w:lvlOverride>
-    <w:lvlOverride w:ilvl="4">
-      <w:startOverride w:val="1"/>
-    </w:lvlOverride>
-    <w:lvlOverride w:ilvl="5">
-      <w:startOverride w:val="1"/>
-    </w:lvlOverride>
-    <w:lvlOverride w:ilvl="6">
-      <w:startOverride w:val="1"/>
-    </w:lvlOverride>
-    <w:lvlOverride w:ilvl="7">
-      <w:startOverride w:val="1"/>
-    </w:lvlOverride>
-    <w:lvlOverride w:ilvl="8">
-      <w:startOverride w:val="1"/>
-    </w:lvlOverride>
   </w:num>
 </w:numbering>
 </file>

</xml_diff>